<commit_message>
Enable on "Advanced syntax and custom resolvers" on Word extract feature
</commit_message>
<xml_diff>
--- a/srv/tests/word-template.docx
+++ b/srv/tests/word-template.docx
@@ -16,10 +16,19 @@
         <w:t>INSTITUTENAME</w:t>
       </w:r>
       <w:r>
+        <w:t xml:space="preserve"> </w:t>
+      </w:r>
+      <w:r>
         <w:t>}</w:t>
       </w:r>
       <w:r>
         <w:t>{/offerValidation}</w:t>
+      </w:r>
+    </w:p>
+    <w:p/>
+    <w:p>
+      <w:r>
+        <w:t>Angular expressions example: {5 + 5}</w:t>
       </w:r>
     </w:p>
     <w:p/>
@@ -82,16 +91,11 @@
             <w:r>
               <w:t>{#</w:t>
             </w:r>
-            <w:proofErr w:type="gramStart"/>
             <w:r>
               <w:t>offerProductValidation</w:t>
             </w:r>
             <w:r>
-              <w:t>}{</w:t>
-            </w:r>
-            <w:proofErr w:type="gramEnd"/>
-            <w:r>
-              <w:t>SKU}</w:t>
+              <w:t>}{SKU}</w:t>
             </w:r>
           </w:p>
         </w:tc>
@@ -117,23 +121,7 @@
               <w:cnfStyle w:val="000000000000" w:firstRow="0" w:lastRow="0" w:firstColumn="0" w:lastColumn="0" w:oddVBand="0" w:evenVBand="0" w:oddHBand="0" w:evenHBand="0" w:firstRowFirstColumn="0" w:firstRowLastColumn="0" w:lastRowFirstColumn="0" w:lastRowLastColumn="0"/>
             </w:pPr>
             <w:r>
-              <w:t>{PAID_</w:t>
-            </w:r>
-            <w:proofErr w:type="gramStart"/>
-            <w:r>
-              <w:t>VOUME}{</w:t>
-            </w:r>
-            <w:proofErr w:type="gramEnd"/>
-            <w:r>
-              <w:t>/</w:t>
-            </w:r>
-            <w:proofErr w:type="spellStart"/>
-            <w:r>
-              <w:t>offerProductValidation</w:t>
-            </w:r>
-            <w:proofErr w:type="spellEnd"/>
-            <w:r>
-              <w:t>}</w:t>
+              <w:t>{PAID_VOUME}{/offerProductValidation}</w:t>
             </w:r>
           </w:p>
         </w:tc>

</xml_diff>